<commit_message>
Atualiza product report do JourneyGraph MNO com as mudancas da sessao
Reflete o punch-list completo e os ajustes de revisao implementados:
tabela de funcionalidades por tela (Digrafo, Mapa, Jornada RG, Rede,
Outliers, Personas, Qualidade, Alertas, nova aba Glossario), nota sobre
o gate de senha do Lounge, cinco novos itens em Ressalvas/Honestidade
Metodologica (campos sinteticos novos, bug de Markov corrigido, formula
Dispositivos x Pessoas, aproximacao do path builder, Sigma Index
sintetico da Jornada RG), historico de evolucao com os 4 commits novos,
volumetria atualizada (index.html cresceu para ~27MB) e dois termos
novos no Glossario (Segmento, Sigma Index).
</commit_message>
<xml_diff>
--- a/docs/produtos/journeygraph-mno-product-report.docx
+++ b/docs/produtos/journeygraph-mno-product-report.docx
@@ -309,7 +309,7 @@
               <w:rPr>
                 <w:sz w:val="19"/>
               </w:rPr>
-              <w:t>Indicadores executivos consolidados: assinantes, alertas abertos, top categorias de uso, top clusters em risco.</w:t>
+              <w:t>Indicadores executivos consolidados: assinantes, alertas abertos, top categorias de uso, top clusters em risco, e novo line chart diário de % de pessoas por persona (série sintética personas_daily).</w:t>
             </w:r>
           </w:p>
         </w:tc>
@@ -337,7 +337,7 @@
               <w:rPr>
                 <w:sz w:val="19"/>
               </w:rPr>
-              <w:t>Grafo força-dirigida (D3) dos 35 clusters geográficos, arestas coloridas por IPED, filtro por faixa e por volume mínimo/máximo de pessoas no trajeto, nós arrastáveis.</w:t>
+              <w:t>Grafo força-dirigida (D3) dos 35 clusters geográficos, arestas coloridas por IPED. Tooltip customizado em cruz na aresta com % sobre o total de trajetos do nó de origem. Line chart de Sigma Index topológico (evolução diária, grau ponderado por dia). Nós sem aresta ganham atração suave ao centro (não derivam do grafo principal). Path builder: clique em nós contíguos monta um caminho, com pessoas/% por aresta e pessoas distintas aproximadas (limite pelo gargalo do caminho). Filtros: Persona, Segmento (pós/controle/pré-pago), Cluster, Dia+Período, Dispositivos↔Pessoas (m/c/p configurável), trajeto por volume mínimo/máximo e faixa IPED — persona agora filtra também as arestas, não só os nós.</w:t>
             </w:r>
           </w:p>
         </w:tc>
@@ -365,7 +365,7 @@
               <w:rPr>
                 <w:sz w:val="19"/>
               </w:rPr>
-              <w:t>Mapa real (Leaflet/OpenStreetMap) com clusters, trajetos, antenas (camada opcional), divisão de Voronoi com indicador selecionável, geofence customizado desenhável pelo usuário.</w:t>
+              <w:t>Mapa real (Leaflet/OpenStreetMap) com clusters, trajetos, antenas (camada opcional), divisão de Voronoi com indicador selecionável, geofence customizado desenhável pelo usuário. Popups mostram nome da persona (não só código), % de concentração de pessoas por nó e % de partida por aresta. Filtro min/máx de pessoas por nó e por aresta, além de Segmento/Cluster/Dia/Período.</w:t>
             </w:r>
           </w:p>
         </w:tc>
@@ -393,7 +393,7 @@
               <w:rPr>
                 <w:sz w:val="19"/>
               </w:rPr>
-              <w:t>Dígrafo circular das transições entre categorias de serviço (RG) por persona, zoom/pan, nós arrastáveis.</w:t>
+              <w:t>Dígrafo das transições entre categorias de serviço (RG) por persona — agora com o mesmo layout de força (d3.forceSimulation) do Dígrafo por clusters, em vez do círculo fixo anterior; nós arrastáveis (só o nó solto se move), zoom/pan. Clique em nó mostra contagem de sessões e % sobre os demais nós; clique em aresta mostra transições absolutas e % a partir do nó de origem. Line chart de Sigma Index topológico (série sintética — não há série diária real para este grafo). Path builder por clique, mesmo padrão do Dígrafo.</w:t>
             </w:r>
           </w:p>
         </w:tc>
@@ -421,7 +421,7 @@
               <w:rPr>
                 <w:sz w:val="19"/>
               </w:rPr>
-              <w:t>Árvore radial da topologia Core→PGW→SGW→Site, blast radius e aviso de SPOF por nó, alerta de saúde (Markov+Bayes) e capacidade/outliers por nó ao clicar.</w:t>
+              <w:t>Árvore radial da topologia Core→PGW→SGW→Site, blast radius e aviso de SPOF por nó, alerta de saúde (Markov+Bayes) e capacidade/outliers por nó ao clicar. Filtro de Dia com marcador visual no gráfico de série e nos valores exibidos no painel de detalhe (usa a série diária real de RAW.series_rede — sem filtro de Persona, que não tem efeito nesse domínio de dado).</w:t>
             </w:r>
           </w:p>
         </w:tc>
@@ -449,7 +449,7 @@
               <w:rPr>
                 <w:sz w:val="19"/>
               </w:rPr>
-              <w:t>Séries temporais por indicador (tráfego, drop, congestionamento) por SGW/PGW/site sinalizado, com MAD e filtro Bayesiano recursivo lado a lado, atribuição de causa tráfego×capacidade.</w:t>
+              <w:t>Séries temporais por indicador (tráfego, drop, congestionamento) por SGW/PGW/site sinalizado, com MAD e filtro Bayesiano recursivo lado a lado, atribuição de causa tráfego×capacidade. Filtro de Dia com marcador visual (linha + ponto destacado) sobre a série real (sem filtro de Persona, sem efeito nesse domínio de dado).</w:t>
             </w:r>
           </w:p>
         </w:tc>
@@ -477,7 +477,7 @@
               <w:rPr>
                 <w:sz w:val="19"/>
               </w:rPr>
-              <w:t>Cartão por persona com critério de inclusão/exclusão, distribuição, indicadores de qualidade esperada e Vamping.</w:t>
+              <w:t>Cartão por persona com critério de inclusão/exclusão, distribuição, indicadores de qualidade esperada e Vamping, com ícone distinto por perfil (em vez de um emoji genérico). Gráfico de pizza da participação % por persona, posicionado como card normal ao final da grade (ao lado do cartão do Gamer).</w:t>
             </w:r>
           </w:p>
         </w:tc>
@@ -505,7 +505,7 @@
               <w:rPr>
                 <w:sz w:val="19"/>
               </w:rPr>
-              <w:t>Indicadores de drop, congestionamento, completamento de voz e SMS por persona.</w:t>
+              <w:t>Indicadores de drop, congestionamento, completamento de voz e SMS por persona, mais novo gráfico de IPED médio por persona (derivado do IPED das arestas ponderado pelo mix de personas dos nós). Filtros de Segmento/Cluster/Dia recalculam Drop/Congestionamento (Voz/SMS seguem o agregado da janela toda, sem granularidade por cluster/dia na base). Sem filtro de Persona — a tela já mostra todas as personas lado a lado.</w:t>
             </w:r>
           </w:p>
         </w:tc>
@@ -533,7 +533,7 @@
               <w:rPr>
                 <w:sz w:val="19"/>
               </w:rPr>
-              <w:t>Duas visões: "Por Persona" (Markov+Bayes por correlação) e "Por Rede" (lista priorizada por score combinado, explicabilidade em 7 seções).</w:t>
+              <w:t>Duas visões: "Por Persona" (Markov+Bayes por correlação) e "Por Rede" (lista priorizada por score combinado, explicabilidade em 7 seções). Layout reequilibrado: a lista de personas/alertas agora é a coluna lateral estreita e a explicabilidade ocupa a área principal, mais ampla. Removido o disclaimer "(paráfrase para fins de demonstração, ver Assistente)" da narrativa — o texto normativo sobre indicadores de qualidade do SMP permanece, sem a ressalva embutida na interface (ver Ressalvas).</w:t>
             </w:r>
           </w:p>
         </w:tc>
@@ -590,6 +590,34 @@
                 <w:sz w:val="19"/>
               </w:rPr>
               <w:t>Consulta de assinante por hash — senha, log de auditoria. Ver capítulo Base Legal.</w:t>
+            </w:r>
+          </w:p>
+        </w:tc>
+      </w:tr>
+      <w:tr>
+        <w:tc>
+          <w:tcPr>
+            <w:tcW w:type="dxa" w:w="4320"/>
+          </w:tcPr>
+          <w:p>
+            <w:r>
+              <w:rPr>
+                <w:sz w:val="19"/>
+              </w:rPr>
+              <w:t>Glossário</w:t>
+            </w:r>
+          </w:p>
+        </w:tc>
+        <w:tc>
+          <w:tcPr>
+            <w:tcW w:type="dxa" w:w="4320"/>
+          </w:tcPr>
+          <w:p>
+            <w:r>
+              <w:rPr>
+                <w:sz w:val="19"/>
+              </w:rPr>
+              <w:t>Quick reference com busca: MAD, IPED, Markov, Bayes/posterior, NQA, blast radius, Sigma Index, K-Means, Segmento, Dispositivos×Pessoas, entre outros. Posicionada como última aba na navegação.</w:t>
             </w:r>
           </w:p>
         </w:tc>
@@ -686,6 +714,15 @@
           <w:i w:val="0"/>
         </w:rPr>
         <w:t>Aplicativo: navegador moderno, arquivo HTML único, sem servidor, banco de dados ou dependência de nuvem além da hospedagem estática (GitHub Pages). Pipeline de dados: executado offline, uma vez, em Python 3.14 com bibliotecas de ciência de dados — não roda no navegador do usuário final.</w:t>
+      </w:r>
+    </w:p>
+    <w:p>
+      <w:r>
+        <w:rPr>
+          <w:b w:val="0"/>
+          <w:i w:val="0"/>
+        </w:rPr>
+        <w:t>Lounge de entrada (index.html na raiz do repositório, fora do app MNO): todos os 6 links de abertura de produto (JourneyGraph ISP, JourneyGraph MNO, NetGraph, ITXView, StepGraph, Égide Vita) passam por um modal de senha (senha ilustrativa, sem persistência — pede a cada clique, mesmo app repetido) antes de navegar para o produto.</w:t>
       </w:r>
     </w:p>
     <w:p>
@@ -2096,6 +2133,170 @@
           </w:p>
         </w:tc>
       </w:tr>
+      <w:tr>
+        <w:tc>
+          <w:tcPr>
+            <w:tcW w:type="dxa" w:w="2880"/>
+          </w:tcPr>
+          <w:p>
+            <w:r>
+              <w:rPr>
+                <w:sz w:val="19"/>
+              </w:rPr>
+              <w:t>bca5c1e</w:t>
+            </w:r>
+          </w:p>
+        </w:tc>
+        <w:tc>
+          <w:tcPr>
+            <w:tcW w:type="dxa" w:w="2880"/>
+          </w:tcPr>
+          <w:p>
+            <w:r>
+              <w:rPr>
+                <w:sz w:val="19"/>
+              </w:rPr>
+              <w:t>2026-08-11</w:t>
+            </w:r>
+          </w:p>
+        </w:tc>
+        <w:tc>
+          <w:tcPr>
+            <w:tcW w:type="dxa" w:w="2880"/>
+          </w:tcPr>
+          <w:p>
+            <w:r>
+              <w:rPr>
+                <w:sz w:val="19"/>
+              </w:rPr>
+              <w:t>Lounge: gate de senha por aplicação e reescreve descrição do card MNO.</w:t>
+            </w:r>
+          </w:p>
+        </w:tc>
+      </w:tr>
+      <w:tr>
+        <w:tc>
+          <w:tcPr>
+            <w:tcW w:type="dxa" w:w="2880"/>
+          </w:tcPr>
+          <w:p>
+            <w:r>
+              <w:rPr>
+                <w:sz w:val="19"/>
+              </w:rPr>
+              <w:t>8a204ec</w:t>
+            </w:r>
+          </w:p>
+        </w:tc>
+        <w:tc>
+          <w:tcPr>
+            <w:tcW w:type="dxa" w:w="2880"/>
+          </w:tcPr>
+          <w:p>
+            <w:r>
+              <w:rPr>
+                <w:sz w:val="19"/>
+              </w:rPr>
+              <w:t>2026-08-11</w:t>
+            </w:r>
+          </w:p>
+        </w:tc>
+        <w:tc>
+          <w:tcPr>
+            <w:tcW w:type="dxa" w:w="2880"/>
+          </w:tcPr>
+          <w:p>
+            <w:r>
+              <w:rPr>
+                <w:sz w:val="19"/>
+              </w:rPr>
+              <w:t>JourneyGraph MNO: implementa punch-list completo — filtros (Segmento/Cluster/Dia/Período/Dispositivos×Pessoas), Dígrafo (tooltip de aresta, Sigma Index, path builder), Mapa, Jornada RG, Rede/Outliers, Personas (pizza+ícones), Qualidade (IPED por persona), Alertas, Glossário; corrige bug de Markov duplicado entre personas.</w:t>
+            </w:r>
+          </w:p>
+        </w:tc>
+      </w:tr>
+      <w:tr>
+        <w:tc>
+          <w:tcPr>
+            <w:tcW w:type="dxa" w:w="2880"/>
+          </w:tcPr>
+          <w:p>
+            <w:r>
+              <w:rPr>
+                <w:sz w:val="19"/>
+              </w:rPr>
+              <w:t>97d270c</w:t>
+            </w:r>
+          </w:p>
+        </w:tc>
+        <w:tc>
+          <w:tcPr>
+            <w:tcW w:type="dxa" w:w="2880"/>
+          </w:tcPr>
+          <w:p>
+            <w:r>
+              <w:rPr>
+                <w:sz w:val="19"/>
+              </w:rPr>
+              <w:t>2026-08-11</w:t>
+            </w:r>
+          </w:p>
+        </w:tc>
+        <w:tc>
+          <w:tcPr>
+            <w:tcW w:type="dxa" w:w="2880"/>
+          </w:tcPr>
+          <w:p>
+            <w:r>
+              <w:rPr>
+                <w:sz w:val="19"/>
+              </w:rPr>
+              <w:t>Lounge: senha sempre pede de novo, sem persistir por sessão.</w:t>
+            </w:r>
+          </w:p>
+        </w:tc>
+      </w:tr>
+      <w:tr>
+        <w:tc>
+          <w:tcPr>
+            <w:tcW w:type="dxa" w:w="2880"/>
+          </w:tcPr>
+          <w:p>
+            <w:r>
+              <w:rPr>
+                <w:sz w:val="19"/>
+              </w:rPr>
+              <w:t>eeffddc</w:t>
+            </w:r>
+          </w:p>
+        </w:tc>
+        <w:tc>
+          <w:tcPr>
+            <w:tcW w:type="dxa" w:w="2880"/>
+          </w:tcPr>
+          <w:p>
+            <w:r>
+              <w:rPr>
+                <w:sz w:val="19"/>
+              </w:rPr>
+              <w:t>2026-08-11</w:t>
+            </w:r>
+          </w:p>
+        </w:tc>
+        <w:tc>
+          <w:tcPr>
+            <w:tcW w:type="dxa" w:w="2880"/>
+          </w:tcPr>
+          <w:p>
+            <w:r>
+              <w:rPr>
+                <w:sz w:val="19"/>
+              </w:rPr>
+              <w:t>JourneyGraph MNO: ajustes de revisão — Glossário movido para última posição, fórmula Dispositivos×Pessoas corrigida, Jornada RG com layout de força (igual Dígrafo), filtro de Persona removido de Rede/Outliers/Qualidade, pizza de Personas reposicionada, área de explicabilidade de Alertas ampliada.</w:t>
+            </w:r>
+          </w:p>
+        </w:tc>
+      </w:tr>
     </w:tbl>
     <w:p/>
     <w:p>
@@ -2591,7 +2792,7 @@
               <w:rPr>
                 <w:sz w:val="19"/>
               </w:rPr>
-              <w:t>18,9 MB (JSON)</w:t>
+              <w:t>~26,4 MB (JSON) — cresceu de 18,9 MB nesta rodada com a adição de segmento, séries diárias por nó/aresta, personas_daily e iped_by_persona</w:t>
             </w:r>
           </w:p>
         </w:tc>
@@ -2619,7 +2820,7 @@
               <w:rPr>
                 <w:sz w:val="19"/>
               </w:rPr>
-              <w:t>19,5 MB bruto / ~2,3 MB comprimido (gzip, servido pelo GitHub Pages)</w:t>
+              <w:t>~26,97 MB bruto / ~3,2 MB comprimido (estimado, mesma razão de compressão gzip anterior)</w:t>
             </w:r>
           </w:p>
         </w:tc>
@@ -2647,7 +2848,7 @@
               <w:rPr>
                 <w:sz w:val="19"/>
               </w:rPr>
-              <w:t>~1.900 (journeygraph-mno/_part2.js)</w:t>
+              <w:t>~2.700 (journeygraph-mno/_part2.js)</w:t>
             </w:r>
           </w:p>
         </w:tc>
@@ -4890,6 +5091,46 @@
       </w:r>
     </w:p>
     <w:p>
+      <w:pPr>
+        <w:pStyle w:val="ListBullet"/>
+      </w:pPr>
+      <w:r>
+        <w:t>Campos sintéticos novos desta rodada (segmento pós-pago/controle/pré-pago por assinante/nó/aresta; séries diárias sintéticas por nó e por aresta; personas_daily; iped_by_persona): não existiam na base original — foram gerados deterministicamente (seed fixa, mesmo padrão do restante do pipeline) para viabilizar os filtros de Segmento, Dia, Período e os gráficos diários pedidos, e estão documentados como tal nos próprios campos de metadata do RAW (metadata.nota_segmento, nota_series_diarias_node_edge, nota_personas_daily, nota_iped_by_persona) — não é dado real de billing nem série temporal medida.</w:t>
+      </w:r>
+    </w:p>
+    <w:p>
+      <w:pPr>
+        <w:pStyle w:val="ListBullet"/>
+      </w:pPr>
+      <w:r>
+        <w:t>Correção de bug real encontrado nesta rodada: as sequências diárias de estado (Markov) do gerador original eram idênticas entre P1≡P3 e entre P2≡P5≡P8 — artefato de reuso de template por faixa de qualidade esperada. Corrigido com um passeio aleatório independente por persona (seed determinística por id de persona); a matriz de transição de cada persona passou a ser genuinamente distinta.</w:t>
+      </w:r>
+    </w:p>
+    <w:p>
+      <w:pPr>
+        <w:pStyle w:val="ListBullet"/>
+      </w:pPr>
+      <w:r>
+        <w:t>Conversão Dispositivos↔Pessoas (pessoas = ((dispositivos×c)/m)/p, onde m = market share, c = % não-IoT, p = penetração de celular): é uma conversão configurável pelo usuário sobre a contagem de dispositivos observada, não uma contagem real de pessoas distintas — o resultado nunca fica abaixo da contagem de dispositivos (clamp explícito no código).</w:t>
+      </w:r>
+    </w:p>
+    <w:p>
+      <w:pPr>
+        <w:pStyle w:val="ListBullet"/>
+      </w:pPr>
+      <w:r>
+        <w:t>Path builder (Dígrafo e Jornada RG): "pessoas distintas no percurso" é uma aproximação pelo gargalo do caminho (mínimo entre os pesos das arestas percorridas), não um rastro individual de assinante entre múltiplos trajetos — a base não tem esse dado a nível de assinante.</w:t>
+      </w:r>
+    </w:p>
+    <w:p>
+      <w:pPr>
+        <w:pStyle w:val="ListBullet"/>
+      </w:pPr>
+      <w:r>
+        <w:t>Sigma Index topológico da Jornada RG é sintético (jitter determinístico por par de nó, não uma série diária real) — a Jornada RG não tem granularidade diária na base de origem, diferente do Dígrafo por clusters, que usa série diária real por nó/aresta.</w:t>
+      </w:r>
+    </w:p>
+    <w:p>
       <w:r>
         <w:br w:type="page"/>
       </w:r>
@@ -6173,6 +6414,88 @@
                 <w:sz w:val="19"/>
               </w:rPr>
               <w:t>Classificador supervisionado (gradient boosting) treinado sobre os rótulos do K-Means, para classificação determinística de persona.</w:t>
+            </w:r>
+          </w:p>
+        </w:tc>
+      </w:tr>
+      <w:tr>
+        <w:tc>
+          <w:tcPr>
+            <w:tcW w:type="dxa" w:w="2880"/>
+          </w:tcPr>
+          <w:p>
+            <w:r>
+              <w:rPr>
+                <w:sz w:val="19"/>
+              </w:rPr>
+              <w:t>Segmento</w:t>
+            </w:r>
+          </w:p>
+        </w:tc>
+        <w:tc>
+          <w:tcPr>
+            <w:tcW w:type="dxa" w:w="2880"/>
+          </w:tcPr>
+          <w:p>
+            <w:r>
+              <w:rPr>
+                <w:sz w:val="19"/>
+              </w:rPr>
+              <w:t>Modelo/Técnica</w:t>
+            </w:r>
+          </w:p>
+        </w:tc>
+        <w:tc>
+          <w:tcPr>
+            <w:tcW w:type="dxa" w:w="2880"/>
+          </w:tcPr>
+          <w:p>
+            <w:r>
+              <w:rPr>
+                <w:sz w:val="19"/>
+              </w:rPr>
+              <w:t>Pós-pago, controle ou pré-pago — campo sintético (não vem do CDR real), gerado por pesos determinísticos por persona para viabilizar o filtro de Segmento.</w:t>
+            </w:r>
+          </w:p>
+        </w:tc>
+      </w:tr>
+      <w:tr>
+        <w:tc>
+          <w:tcPr>
+            <w:tcW w:type="dxa" w:w="2880"/>
+          </w:tcPr>
+          <w:p>
+            <w:r>
+              <w:rPr>
+                <w:sz w:val="19"/>
+              </w:rPr>
+              <w:t>Sigma Index (σ)</w:t>
+            </w:r>
+          </w:p>
+        </w:tc>
+        <w:tc>
+          <w:tcPr>
+            <w:tcW w:type="dxa" w:w="2880"/>
+          </w:tcPr>
+          <w:p>
+            <w:r>
+              <w:rPr>
+                <w:sz w:val="19"/>
+              </w:rPr>
+              <w:t>Modelo/Técnica</w:t>
+            </w:r>
+          </w:p>
+        </w:tc>
+        <w:tc>
+          <w:tcPr>
+            <w:tcW w:type="dxa" w:w="2880"/>
+          </w:tcPr>
+          <w:p>
+            <w:r>
+              <w:rPr>
+                <w:sz w:val="19"/>
+              </w:rPr>
+              <w:t>Índice topológico de grafo: σ(G) = Σ(grau(u)−grau(v))² sobre as arestas, com grau ponderado pelo tráfego diário — mede heterogeneidade da distribuição de grau. Exibido como série diária no Dígrafo e na Jornada RG.</w:t>
             </w:r>
           </w:p>
         </w:tc>

</xml_diff>